<commit_message>
Remove the invented-late-shift claim after reviewing the rehab report
The rehab report's form actually ticks the "Früh-/Spätschicht" box, so
the "late shift was invented" argument was incorrect and would undermine
credibility. Replaces it across the appeal letters, handover letter,
Word version, and pebb zwei prep with the stronger, accurate points: the
report itself advises against returning to the employer, the condition
worsened since October 2025, and the newer attestations were ignored.

Co-Authored-By: Claude Opus 4.8 <noreply@anthropic.com>
Claude-Session: https://claude.ai/code/session_01K5VRujcktxbUqpQLMSZA9Y
</commit_message>
<xml_diff>
--- a/outputs/Uebergabe-Sozialverband-Karin-Deike.docx
+++ b/outputs/Uebergabe-Sozialverband-Karin-Deike.docx
@@ -167,7 +167,19 @@
           <w:b w:val="0"/>
           <w:i w:val="0"/>
         </w:rPr>
-        <w:t>Im Bescheid vom 19. Juni 2026 schreibt die Rentenversicherung, zumutbar seien „mittelschwere Arbeiten überwiegend im Stehen, Gehen und Sitzen in Früh-/Tag-/Spätschicht im zeitlichen Umfang von 6 Stunden und mehr“. Die dort genannte „Spätschicht“ kommt in keinem einzigen Attest meiner Ärzte und Therapeuten vor – und auch nicht im Reha-Entlassungsbericht. Die Rentenversicherung hat sie ohne jede medizinische Grundlage selbst hinzugefügt. Eine Bürokauffrau arbeitet zudem überhaupt nicht in Spätschicht.</w:t>
+        <w:t>Der Reha-Entlassungsbericht selbst hält ausdrücklich fest:</w:t>
+      </w:r>
+    </w:p>
+    <w:p>
+      <w:pPr>
+        <w:jc w:val="both"/>
+      </w:pPr>
+      <w:r>
+        <w:rPr>
+          <w:b w:val="0"/>
+          <w:i/>
+        </w:rPr>
+        <w:t>„Eine Rückkehr an den aktuellen Arbeitsplatz sowie zum Arbeitgeber Freie und Hansestadt Hamburg wird nicht empfohlen, um eine erneute psychische Dekompensation zu vermeiden.“</w:t>
       </w:r>
     </w:p>
     <w:p>
@@ -179,31 +191,7 @@
           <w:b w:val="0"/>
           <w:i w:val="0"/>
         </w:rPr>
-        <w:t>Der Reha-Entlassungsbericht schreibt wörtlich:</w:t>
-      </w:r>
-    </w:p>
-    <w:p>
-      <w:pPr>
-        <w:jc w:val="both"/>
-      </w:pPr>
-      <w:r>
-        <w:rPr>
-          <w:b w:val="0"/>
-          <w:i/>
-        </w:rPr>
-        <w:t>„Aus psychosomatischer Sicht besteht sowohl für die zuletzt ausgeübte Tätigkeit als Sachbearbeiterin als auch für den allgemeinen Arbeitsmarkt ein Leistungsvermögen von sechs Stunden und mehr pro Tag für mittelschwere körperliche Tätigkeiten mit einer Arbeitshaltung überwiegend im Sitzen, Stehen und Gehen, mit folgenden qualitativen Einschränkungen: keine Nachtschichten, keine übermäßige emotionale oder Stressbelastung.“</w:t>
-      </w:r>
-    </w:p>
-    <w:p>
-      <w:pPr>
-        <w:jc w:val="both"/>
-      </w:pPr>
-      <w:r>
-        <w:rPr>
-          <w:b w:val="0"/>
-          <w:i w:val="0"/>
-        </w:rPr>
-        <w:t>Von einer „Spätschicht“ ist also auch dort keine Rede.</w:t>
+        <w:t>Meine gesundheitliche Situation hat sich seit dem Reha-Bericht (Oktober 2025) weiter verschlechtert. Das aktuelle Attest von Dr. Horstmann vom 29. Juni 2026 bestätigt, dass eine Tätigkeit im kaufmännisch-verwaltenden Bereich für mich nicht mehr in Betracht kommt und eine Umschulung dringend erforderlich ist.</w:t>
       </w:r>
     </w:p>
     <w:p>

</xml_diff>